<commit_message>
Ajustar estilo del taller: sin banners, acento morado, color solo en estados
Co-Authored-By: Claude Sonnet 5.5 <noreply@anthropic.com>
Claude-Session: https://claude.ai/code/session_01JYwT5WGdJ3Aonr86MivTRb
</commit_message>
<xml_diff>
--- a/Taller_Metricas_LogiTrack.docx
+++ b/Taller_Metricas_LogiTrack.docx
@@ -11,7 +11,7 @@
           <w:rFonts w:ascii="Calibri" w:cs="Calibri" w:eastAsia="Calibri" w:hAnsi="Calibri"/>
           <w:b/>
           <w:bCs/>
-          <w:color w:val="6B7C93"/>
+          <w:color w:val="7A5BA8"/>
           <w:sz w:val="20"/>
           <w:szCs w:val="20"/>
         </w:rPr>
@@ -27,7 +27,7 @@
           <w:rFonts w:ascii="Calibri" w:cs="Calibri" w:eastAsia="Calibri" w:hAnsi="Calibri"/>
           <w:b/>
           <w:bCs/>
-          <w:color w:val="1F3A5F"/>
+          <w:color w:val="5B3F8C"/>
           <w:sz w:val="48"/>
           <w:szCs w:val="48"/>
         </w:rPr>
@@ -37,7 +37,7 @@
     <w:p>
       <w:pPr>
         <w:pBdr>
-          <w:bottom w:val="single" w:color="1F3A5F" w:sz="8" w:space="6"/>
+          <w:bottom w:val="single" w:color="5B3F8C" w:sz="8" w:space="6"/>
         </w:pBdr>
         <w:spacing w:after="200"/>
       </w:pPr>
@@ -51,62 +51,25 @@
         <w:t xml:space="preserve">Prueba piloto de CaribeLog S.A.S. · ¿Está LogiTrack listo para producción?</w:t>
       </w:r>
     </w:p>
-    <w:tbl>
-      <w:tblPr>
-        <w:tblW w:type="dxa" w:w="9360"/>
-        <w:tblBorders>
-          <w:top w:val="single" w:color="auto" w:sz="4"/>
-          <w:left w:val="single" w:color="auto" w:sz="4"/>
-          <w:bottom w:val="single" w:color="auto" w:sz="4"/>
-          <w:right w:val="single" w:color="auto" w:sz="4"/>
-          <w:insideH w:val="single" w:color="auto" w:sz="4"/>
-          <w:insideV w:val="single" w:color="auto" w:sz="4"/>
-        </w:tblBorders>
-      </w:tblPr>
-      <w:tblGrid>
-        <w:gridCol w:w="9360"/>
-      </w:tblGrid>
-      <w:tr>
-        <w:tc>
-          <w:tcPr>
-            <w:tcW w:type="dxa" w:w="9360"/>
-            <w:tcBorders>
-              <w:top w:val="none" w:color="FFFFFF" w:sz="0"/>
-              <w:left w:val="single" w:color="1F3A5F" w:sz="24"/>
-              <w:bottom w:val="none" w:color="FFFFFF" w:sz="0"/>
-              <w:right w:val="none" w:color="FFFFFF" w:sz="0"/>
-            </w:tcBorders>
-            <w:shd w:fill="E8F0F8" w:color="auto" w:val="clear"/>
-            <w:tcMar>
-              <w:top w:type="dxa" w:w="120"/>
-              <w:left w:type="dxa" w:w="200"/>
-              <w:bottom w:type="dxa" w:w="120"/>
-              <w:right w:type="dxa" w:w="200"/>
-            </w:tcMar>
-          </w:tcPr>
-          <w:p>
-            <w:r>
-              <w:rPr>
-                <w:rFonts w:ascii="Calibri" w:cs="Calibri" w:eastAsia="Calibri" w:hAnsi="Calibri"/>
-                <w:b/>
-                <w:bCs/>
-                <w:sz w:val="21"/>
-                <w:szCs w:val="21"/>
-              </w:rPr>
-              <w:t xml:space="preserve">Dictamen: NO se recomienda liberar LogiTrack a producción en este momento.</w:t>
-            </w:r>
-            <w:r>
-              <w:rPr>
-                <w:rFonts w:ascii="Calibri" w:cs="Calibri" w:eastAsia="Calibri" w:hAnsi="Calibri"/>
-                <w:sz w:val="21"/>
-                <w:szCs w:val="21"/>
-              </w:rPr>
-              <w:t xml:space="preserve"> De los 7 indicadores con referencia, solo 1 cumple (tiempo medio de resolución). Hay 3 defectos críticos abiertos, 24 casos de prueba sin ejecutar y una disponibilidad por debajo de la meta. Se propone una liberación condicionada a criterios de salida medibles (sección 9).</w:t>
-            </w:r>
-          </w:p>
-        </w:tc>
-      </w:tr>
-    </w:tbl>
+    <w:p>
+      <w:pPr>
+        <w:spacing w:after="120" w:line="276"/>
+      </w:pPr>
+      <w:r>
+        <w:rPr>
+          <w:rFonts w:ascii="Calibri" w:cs="Calibri" w:eastAsia="Calibri" w:hAnsi="Calibri"/>
+          <w:b/>
+          <w:bCs/>
+        </w:rPr>
+        <w:t xml:space="preserve">Dictamen: NO se recomienda liberar LogiTrack a producción en este momento.</w:t>
+      </w:r>
+      <w:r>
+        <w:rPr>
+          <w:rFonts w:ascii="Calibri" w:cs="Calibri" w:eastAsia="Calibri" w:hAnsi="Calibri"/>
+        </w:rPr>
+        <w:t xml:space="preserve"> De los 7 indicadores con referencia, solo 1 cumple (tiempo medio de resolución). Hay 3 defectos críticos abiertos, 24 casos de prueba sin ejecutar y una disponibilidad por debajo de la meta. Se propone una liberación condicionada a criterios de salida medibles (sección 9).</w:t>
+      </w:r>
+    </w:p>
     <w:p>
       <w:pPr>
         <w:spacing w:after="80"/>
@@ -213,7 +176,7 @@
               <w:bottom w:val="single" w:color="B8C2CC" w:sz="4"/>
               <w:right w:val="single" w:color="B8C2CC" w:sz="4"/>
             </w:tcBorders>
-            <w:shd w:fill="1F3A5F" w:color="auto" w:val="clear"/>
+            <w:shd w:fill="5B3F8C" w:color="auto" w:val="clear"/>
             <w:tcMar>
               <w:top w:type="dxa" w:w="60"/>
               <w:left w:type="dxa" w:w="100"/>
@@ -245,7 +208,7 @@
               <w:bottom w:val="single" w:color="B8C2CC" w:sz="4"/>
               <w:right w:val="single" w:color="B8C2CC" w:sz="4"/>
             </w:tcBorders>
-            <w:shd w:fill="1F3A5F" w:color="auto" w:val="clear"/>
+            <w:shd w:fill="5B3F8C" w:color="auto" w:val="clear"/>
             <w:tcMar>
               <w:top w:type="dxa" w:w="60"/>
               <w:left w:type="dxa" w:w="100"/>
@@ -277,7 +240,7 @@
               <w:bottom w:val="single" w:color="B8C2CC" w:sz="4"/>
               <w:right w:val="single" w:color="B8C2CC" w:sz="4"/>
             </w:tcBorders>
-            <w:shd w:fill="1F3A5F" w:color="auto" w:val="clear"/>
+            <w:shd w:fill="5B3F8C" w:color="auto" w:val="clear"/>
             <w:tcMar>
               <w:top w:type="dxa" w:w="60"/>
               <w:left w:type="dxa" w:w="100"/>
@@ -409,7 +372,6 @@
               <w:bottom w:val="single" w:color="B8C2CC" w:sz="4"/>
               <w:right w:val="single" w:color="B8C2CC" w:sz="4"/>
             </w:tcBorders>
-            <w:shd w:fill="F3F6F9" w:color="auto" w:val="clear"/>
             <w:tcMar>
               <w:top w:type="dxa" w:w="60"/>
               <w:left w:type="dxa" w:w="100"/>
@@ -440,7 +402,6 @@
               <w:bottom w:val="single" w:color="B8C2CC" w:sz="4"/>
               <w:right w:val="single" w:color="B8C2CC" w:sz="4"/>
             </w:tcBorders>
-            <w:shd w:fill="F3F6F9" w:color="auto" w:val="clear"/>
             <w:tcMar>
               <w:top w:type="dxa" w:w="60"/>
               <w:left w:type="dxa" w:w="100"/>
@@ -471,7 +432,6 @@
               <w:bottom w:val="single" w:color="B8C2CC" w:sz="4"/>
               <w:right w:val="single" w:color="B8C2CC" w:sz="4"/>
             </w:tcBorders>
-            <w:shd w:fill="F3F6F9" w:color="auto" w:val="clear"/>
             <w:tcMar>
               <w:top w:type="dxa" w:w="60"/>
               <w:left w:type="dxa" w:w="100"/>
@@ -602,7 +562,6 @@
               <w:bottom w:val="single" w:color="B8C2CC" w:sz="4"/>
               <w:right w:val="single" w:color="B8C2CC" w:sz="4"/>
             </w:tcBorders>
-            <w:shd w:fill="F3F6F9" w:color="auto" w:val="clear"/>
             <w:tcMar>
               <w:top w:type="dxa" w:w="60"/>
               <w:left w:type="dxa" w:w="100"/>
@@ -633,7 +592,6 @@
               <w:bottom w:val="single" w:color="B8C2CC" w:sz="4"/>
               <w:right w:val="single" w:color="B8C2CC" w:sz="4"/>
             </w:tcBorders>
-            <w:shd w:fill="F3F6F9" w:color="auto" w:val="clear"/>
             <w:tcMar>
               <w:top w:type="dxa" w:w="60"/>
               <w:left w:type="dxa" w:w="100"/>
@@ -664,7 +622,6 @@
               <w:bottom w:val="single" w:color="B8C2CC" w:sz="4"/>
               <w:right w:val="single" w:color="B8C2CC" w:sz="4"/>
             </w:tcBorders>
-            <w:shd w:fill="F3F6F9" w:color="auto" w:val="clear"/>
             <w:tcMar>
               <w:top w:type="dxa" w:w="60"/>
               <w:left w:type="dxa" w:w="100"/>
@@ -746,7 +703,7 @@
               <w:bottom w:val="single" w:color="B8C2CC" w:sz="4"/>
               <w:right w:val="single" w:color="B8C2CC" w:sz="4"/>
             </w:tcBorders>
-            <w:shd w:fill="1F3A5F" w:color="auto" w:val="clear"/>
+            <w:shd w:fill="5B3F8C" w:color="auto" w:val="clear"/>
             <w:tcMar>
               <w:top w:type="dxa" w:w="60"/>
               <w:left w:type="dxa" w:w="100"/>
@@ -766,7 +723,7 @@
               <w:bottom w:val="single" w:color="B8C2CC" w:sz="4"/>
               <w:right w:val="single" w:color="B8C2CC" w:sz="4"/>
             </w:tcBorders>
-            <w:shd w:fill="1F3A5F" w:color="auto" w:val="clear"/>
+            <w:shd w:fill="5B3F8C" w:color="auto" w:val="clear"/>
             <w:tcMar>
               <w:top w:type="dxa" w:w="60"/>
               <w:left w:type="dxa" w:w="100"/>
@@ -798,7 +755,7 @@
               <w:bottom w:val="single" w:color="B8C2CC" w:sz="4"/>
               <w:right w:val="single" w:color="B8C2CC" w:sz="4"/>
             </w:tcBorders>
-            <w:shd w:fill="1F3A5F" w:color="auto" w:val="clear"/>
+            <w:shd w:fill="5B3F8C" w:color="auto" w:val="clear"/>
             <w:tcMar>
               <w:top w:type="dxa" w:w="60"/>
               <w:left w:type="dxa" w:w="100"/>
@@ -830,7 +787,7 @@
               <w:bottom w:val="single" w:color="B8C2CC" w:sz="4"/>
               <w:right w:val="single" w:color="B8C2CC" w:sz="4"/>
             </w:tcBorders>
-            <w:shd w:fill="1F3A5F" w:color="auto" w:val="clear"/>
+            <w:shd w:fill="5B3F8C" w:color="auto" w:val="clear"/>
             <w:tcMar>
               <w:top w:type="dxa" w:w="60"/>
               <w:left w:type="dxa" w:w="100"/>
@@ -992,7 +949,6 @@
               <w:bottom w:val="single" w:color="B8C2CC" w:sz="4"/>
               <w:right w:val="single" w:color="B8C2CC" w:sz="4"/>
             </w:tcBorders>
-            <w:shd w:fill="F3F6F9" w:color="auto" w:val="clear"/>
             <w:tcMar>
               <w:top w:type="dxa" w:w="60"/>
               <w:left w:type="dxa" w:w="100"/>
@@ -1023,7 +979,6 @@
               <w:bottom w:val="single" w:color="B8C2CC" w:sz="4"/>
               <w:right w:val="single" w:color="B8C2CC" w:sz="4"/>
             </w:tcBorders>
-            <w:shd w:fill="F3F6F9" w:color="auto" w:val="clear"/>
             <w:tcMar>
               <w:top w:type="dxa" w:w="60"/>
               <w:left w:type="dxa" w:w="100"/>
@@ -1054,7 +1009,6 @@
               <w:bottom w:val="single" w:color="B8C2CC" w:sz="4"/>
               <w:right w:val="single" w:color="B8C2CC" w:sz="4"/>
             </w:tcBorders>
-            <w:shd w:fill="F3F6F9" w:color="auto" w:val="clear"/>
             <w:tcMar>
               <w:top w:type="dxa" w:w="60"/>
               <w:left w:type="dxa" w:w="100"/>
@@ -1085,7 +1039,6 @@
               <w:bottom w:val="single" w:color="B8C2CC" w:sz="4"/>
               <w:right w:val="single" w:color="B8C2CC" w:sz="4"/>
             </w:tcBorders>
-            <w:shd w:fill="F3F6F9" w:color="auto" w:val="clear"/>
             <w:tcMar>
               <w:top w:type="dxa" w:w="60"/>
               <w:left w:type="dxa" w:w="100"/>
@@ -1246,7 +1199,6 @@
               <w:bottom w:val="single" w:color="B8C2CC" w:sz="4"/>
               <w:right w:val="single" w:color="B8C2CC" w:sz="4"/>
             </w:tcBorders>
-            <w:shd w:fill="F3F6F9" w:color="auto" w:val="clear"/>
             <w:tcMar>
               <w:top w:type="dxa" w:w="60"/>
               <w:left w:type="dxa" w:w="100"/>
@@ -1277,7 +1229,6 @@
               <w:bottom w:val="single" w:color="B8C2CC" w:sz="4"/>
               <w:right w:val="single" w:color="B8C2CC" w:sz="4"/>
             </w:tcBorders>
-            <w:shd w:fill="F3F6F9" w:color="auto" w:val="clear"/>
             <w:tcMar>
               <w:top w:type="dxa" w:w="60"/>
               <w:left w:type="dxa" w:w="100"/>
@@ -1308,7 +1259,6 @@
               <w:bottom w:val="single" w:color="B8C2CC" w:sz="4"/>
               <w:right w:val="single" w:color="B8C2CC" w:sz="4"/>
             </w:tcBorders>
-            <w:shd w:fill="F3F6F9" w:color="auto" w:val="clear"/>
             <w:tcMar>
               <w:top w:type="dxa" w:w="60"/>
               <w:left w:type="dxa" w:w="100"/>
@@ -1339,7 +1289,6 @@
               <w:bottom w:val="single" w:color="B8C2CC" w:sz="4"/>
               <w:right w:val="single" w:color="B8C2CC" w:sz="4"/>
             </w:tcBorders>
-            <w:shd w:fill="F3F6F9" w:color="auto" w:val="clear"/>
             <w:tcMar>
               <w:top w:type="dxa" w:w="60"/>
               <w:left w:type="dxa" w:w="100"/>
@@ -1422,7 +1371,7 @@
               <w:bottom w:val="single" w:color="B8C2CC" w:sz="4"/>
               <w:right w:val="single" w:color="B8C2CC" w:sz="4"/>
             </w:tcBorders>
-            <w:shd w:fill="1F3A5F" w:color="auto" w:val="clear"/>
+            <w:shd w:fill="5B3F8C" w:color="auto" w:val="clear"/>
             <w:tcMar>
               <w:top w:type="dxa" w:w="60"/>
               <w:left w:type="dxa" w:w="100"/>
@@ -1454,7 +1403,7 @@
               <w:bottom w:val="single" w:color="B8C2CC" w:sz="4"/>
               <w:right w:val="single" w:color="B8C2CC" w:sz="4"/>
             </w:tcBorders>
-            <w:shd w:fill="1F3A5F" w:color="auto" w:val="clear"/>
+            <w:shd w:fill="5B3F8C" w:color="auto" w:val="clear"/>
             <w:tcMar>
               <w:top w:type="dxa" w:w="60"/>
               <w:left w:type="dxa" w:w="100"/>
@@ -1489,7 +1438,7 @@
               <w:bottom w:val="single" w:color="B8C2CC" w:sz="4"/>
               <w:right w:val="single" w:color="B8C2CC" w:sz="4"/>
             </w:tcBorders>
-            <w:shd w:fill="1F3A5F" w:color="auto" w:val="clear"/>
+            <w:shd w:fill="5B3F8C" w:color="auto" w:val="clear"/>
             <w:tcMar>
               <w:top w:type="dxa" w:w="60"/>
               <w:left w:type="dxa" w:w="100"/>
@@ -1524,7 +1473,7 @@
               <w:bottom w:val="single" w:color="B8C2CC" w:sz="4"/>
               <w:right w:val="single" w:color="B8C2CC" w:sz="4"/>
             </w:tcBorders>
-            <w:shd w:fill="1F3A5F" w:color="auto" w:val="clear"/>
+            <w:shd w:fill="5B3F8C" w:color="auto" w:val="clear"/>
             <w:tcMar>
               <w:top w:type="dxa" w:w="60"/>
               <w:left w:type="dxa" w:w="100"/>
@@ -1559,7 +1508,7 @@
               <w:bottom w:val="single" w:color="B8C2CC" w:sz="4"/>
               <w:right w:val="single" w:color="B8C2CC" w:sz="4"/>
             </w:tcBorders>
-            <w:shd w:fill="1F3A5F" w:color="auto" w:val="clear"/>
+            <w:shd w:fill="5B3F8C" w:color="auto" w:val="clear"/>
             <w:tcMar>
               <w:top w:type="dxa" w:w="60"/>
               <w:left w:type="dxa" w:w="100"/>
@@ -1767,7 +1716,6 @@
               <w:bottom w:val="single" w:color="B8C2CC" w:sz="4"/>
               <w:right w:val="single" w:color="B8C2CC" w:sz="4"/>
             </w:tcBorders>
-            <w:shd w:fill="F3F6F9" w:color="auto" w:val="clear"/>
             <w:tcMar>
               <w:top w:type="dxa" w:w="60"/>
               <w:left w:type="dxa" w:w="100"/>
@@ -1798,7 +1746,6 @@
               <w:bottom w:val="single" w:color="B8C2CC" w:sz="4"/>
               <w:right w:val="single" w:color="B8C2CC" w:sz="4"/>
             </w:tcBorders>
-            <w:shd w:fill="F3F6F9" w:color="auto" w:val="clear"/>
             <w:tcMar>
               <w:top w:type="dxa" w:w="60"/>
               <w:left w:type="dxa" w:w="100"/>
@@ -1866,7 +1813,6 @@
               <w:bottom w:val="single" w:color="B8C2CC" w:sz="4"/>
               <w:right w:val="single" w:color="B8C2CC" w:sz="4"/>
             </w:tcBorders>
-            <w:shd w:fill="F3F6F9" w:color="auto" w:val="clear"/>
             <w:tcMar>
               <w:top w:type="dxa" w:w="60"/>
               <w:left w:type="dxa" w:w="100"/>
@@ -1900,7 +1846,6 @@
               <w:bottom w:val="single" w:color="B8C2CC" w:sz="4"/>
               <w:right w:val="single" w:color="B8C2CC" w:sz="4"/>
             </w:tcBorders>
-            <w:shd w:fill="F3F6F9" w:color="auto" w:val="clear"/>
             <w:tcMar>
               <w:top w:type="dxa" w:w="60"/>
               <w:left w:type="dxa" w:w="100"/>
@@ -2107,7 +2052,6 @@
               <w:bottom w:val="single" w:color="B8C2CC" w:sz="4"/>
               <w:right w:val="single" w:color="B8C2CC" w:sz="4"/>
             </w:tcBorders>
-            <w:shd w:fill="F3F6F9" w:color="auto" w:val="clear"/>
             <w:tcMar>
               <w:top w:type="dxa" w:w="60"/>
               <w:left w:type="dxa" w:w="100"/>
@@ -2138,7 +2082,6 @@
               <w:bottom w:val="single" w:color="B8C2CC" w:sz="4"/>
               <w:right w:val="single" w:color="B8C2CC" w:sz="4"/>
             </w:tcBorders>
-            <w:shd w:fill="F3F6F9" w:color="auto" w:val="clear"/>
             <w:tcMar>
               <w:top w:type="dxa" w:w="60"/>
               <w:left w:type="dxa" w:w="100"/>
@@ -2206,7 +2149,6 @@
               <w:bottom w:val="single" w:color="B8C2CC" w:sz="4"/>
               <w:right w:val="single" w:color="B8C2CC" w:sz="4"/>
             </w:tcBorders>
-            <w:shd w:fill="F3F6F9" w:color="auto" w:val="clear"/>
             <w:tcMar>
               <w:top w:type="dxa" w:w="60"/>
               <w:left w:type="dxa" w:w="100"/>
@@ -2240,7 +2182,6 @@
               <w:bottom w:val="single" w:color="B8C2CC" w:sz="4"/>
               <w:right w:val="single" w:color="B8C2CC" w:sz="4"/>
             </w:tcBorders>
-            <w:shd w:fill="F3F6F9" w:color="auto" w:val="clear"/>
             <w:tcMar>
               <w:top w:type="dxa" w:w="60"/>
               <w:left w:type="dxa" w:w="100"/>
@@ -2447,7 +2388,6 @@
               <w:bottom w:val="single" w:color="B8C2CC" w:sz="4"/>
               <w:right w:val="single" w:color="B8C2CC" w:sz="4"/>
             </w:tcBorders>
-            <w:shd w:fill="F3F6F9" w:color="auto" w:val="clear"/>
             <w:tcMar>
               <w:top w:type="dxa" w:w="60"/>
               <w:left w:type="dxa" w:w="100"/>
@@ -2478,7 +2418,6 @@
               <w:bottom w:val="single" w:color="B8C2CC" w:sz="4"/>
               <w:right w:val="single" w:color="B8C2CC" w:sz="4"/>
             </w:tcBorders>
-            <w:shd w:fill="F3F6F9" w:color="auto" w:val="clear"/>
             <w:tcMar>
               <w:top w:type="dxa" w:w="60"/>
               <w:left w:type="dxa" w:w="100"/>
@@ -2546,7 +2485,6 @@
               <w:bottom w:val="single" w:color="B8C2CC" w:sz="4"/>
               <w:right w:val="single" w:color="B8C2CC" w:sz="4"/>
             </w:tcBorders>
-            <w:shd w:fill="F3F6F9" w:color="auto" w:val="clear"/>
             <w:tcMar>
               <w:top w:type="dxa" w:w="60"/>
               <w:left w:type="dxa" w:w="100"/>
@@ -2580,7 +2518,6 @@
               <w:bottom w:val="single" w:color="B8C2CC" w:sz="4"/>
               <w:right w:val="single" w:color="B8C2CC" w:sz="4"/>
             </w:tcBorders>
-            <w:shd w:fill="F3F6F9" w:color="auto" w:val="clear"/>
             <w:tcMar>
               <w:top w:type="dxa" w:w="60"/>
               <w:left w:type="dxa" w:w="100"/>
@@ -2833,7 +2770,7 @@
               <w:bottom w:val="single" w:color="B8C2CC" w:sz="4"/>
               <w:right w:val="single" w:color="B8C2CC" w:sz="4"/>
             </w:tcBorders>
-            <w:shd w:fill="1F3A5F" w:color="auto" w:val="clear"/>
+            <w:shd w:fill="5B3F8C" w:color="auto" w:val="clear"/>
             <w:tcMar>
               <w:top w:type="dxa" w:w="60"/>
               <w:left w:type="dxa" w:w="100"/>
@@ -2865,7 +2802,7 @@
               <w:bottom w:val="single" w:color="B8C2CC" w:sz="4"/>
               <w:right w:val="single" w:color="B8C2CC" w:sz="4"/>
             </w:tcBorders>
-            <w:shd w:fill="1F3A5F" w:color="auto" w:val="clear"/>
+            <w:shd w:fill="5B3F8C" w:color="auto" w:val="clear"/>
             <w:tcMar>
               <w:top w:type="dxa" w:w="60"/>
               <w:left w:type="dxa" w:w="100"/>
@@ -2900,7 +2837,7 @@
               <w:bottom w:val="single" w:color="B8C2CC" w:sz="4"/>
               <w:right w:val="single" w:color="B8C2CC" w:sz="4"/>
             </w:tcBorders>
-            <w:shd w:fill="1F3A5F" w:color="auto" w:val="clear"/>
+            <w:shd w:fill="5B3F8C" w:color="auto" w:val="clear"/>
             <w:tcMar>
               <w:top w:type="dxa" w:w="60"/>
               <w:left w:type="dxa" w:w="100"/>
@@ -2935,7 +2872,7 @@
               <w:bottom w:val="single" w:color="B8C2CC" w:sz="4"/>
               <w:right w:val="single" w:color="B8C2CC" w:sz="4"/>
             </w:tcBorders>
-            <w:shd w:fill="1F3A5F" w:color="auto" w:val="clear"/>
+            <w:shd w:fill="5B3F8C" w:color="auto" w:val="clear"/>
             <w:tcMar>
               <w:top w:type="dxa" w:w="60"/>
               <w:left w:type="dxa" w:w="100"/>
@@ -3109,7 +3046,6 @@
               <w:bottom w:val="single" w:color="B8C2CC" w:sz="4"/>
               <w:right w:val="single" w:color="B8C2CC" w:sz="4"/>
             </w:tcBorders>
-            <w:shd w:fill="F3F6F9" w:color="auto" w:val="clear"/>
             <w:tcMar>
               <w:top w:type="dxa" w:w="60"/>
               <w:left w:type="dxa" w:w="100"/>
@@ -3140,7 +3076,6 @@
               <w:bottom w:val="single" w:color="B8C2CC" w:sz="4"/>
               <w:right w:val="single" w:color="B8C2CC" w:sz="4"/>
             </w:tcBorders>
-            <w:shd w:fill="F3F6F9" w:color="auto" w:val="clear"/>
             <w:tcMar>
               <w:top w:type="dxa" w:w="60"/>
               <w:left w:type="dxa" w:w="100"/>
@@ -3174,7 +3109,6 @@
               <w:bottom w:val="single" w:color="B8C2CC" w:sz="4"/>
               <w:right w:val="single" w:color="B8C2CC" w:sz="4"/>
             </w:tcBorders>
-            <w:shd w:fill="F3F6F9" w:color="auto" w:val="clear"/>
             <w:tcMar>
               <w:top w:type="dxa" w:w="60"/>
               <w:left w:type="dxa" w:w="100"/>
@@ -3208,7 +3142,6 @@
               <w:bottom w:val="single" w:color="B8C2CC" w:sz="4"/>
               <w:right w:val="single" w:color="B8C2CC" w:sz="4"/>
             </w:tcBorders>
-            <w:shd w:fill="F3F6F9" w:color="auto" w:val="clear"/>
             <w:tcMar>
               <w:top w:type="dxa" w:w="60"/>
               <w:left w:type="dxa" w:w="100"/>
@@ -3381,7 +3314,6 @@
               <w:bottom w:val="single" w:color="B8C2CC" w:sz="4"/>
               <w:right w:val="single" w:color="B8C2CC" w:sz="4"/>
             </w:tcBorders>
-            <w:shd w:fill="F3F6F9" w:color="auto" w:val="clear"/>
             <w:tcMar>
               <w:top w:type="dxa" w:w="60"/>
               <w:left w:type="dxa" w:w="100"/>
@@ -3412,7 +3344,6 @@
               <w:bottom w:val="single" w:color="B8C2CC" w:sz="4"/>
               <w:right w:val="single" w:color="B8C2CC" w:sz="4"/>
             </w:tcBorders>
-            <w:shd w:fill="F3F6F9" w:color="auto" w:val="clear"/>
             <w:tcMar>
               <w:top w:type="dxa" w:w="60"/>
               <w:left w:type="dxa" w:w="100"/>
@@ -3446,7 +3377,6 @@
               <w:bottom w:val="single" w:color="B8C2CC" w:sz="4"/>
               <w:right w:val="single" w:color="B8C2CC" w:sz="4"/>
             </w:tcBorders>
-            <w:shd w:fill="F3F6F9" w:color="auto" w:val="clear"/>
             <w:tcMar>
               <w:top w:type="dxa" w:w="60"/>
               <w:left w:type="dxa" w:w="100"/>
@@ -3480,7 +3410,6 @@
               <w:bottom w:val="single" w:color="B8C2CC" w:sz="4"/>
               <w:right w:val="single" w:color="B8C2CC" w:sz="4"/>
             </w:tcBorders>
-            <w:shd w:fill="F3F6F9" w:color="auto" w:val="clear"/>
             <w:tcMar>
               <w:top w:type="dxa" w:w="60"/>
               <w:left w:type="dxa" w:w="100"/>
@@ -3653,7 +3582,6 @@
               <w:bottom w:val="single" w:color="B8C2CC" w:sz="4"/>
               <w:right w:val="single" w:color="B8C2CC" w:sz="4"/>
             </w:tcBorders>
-            <w:shd w:fill="F3F6F9" w:color="auto" w:val="clear"/>
             <w:tcMar>
               <w:top w:type="dxa" w:w="60"/>
               <w:left w:type="dxa" w:w="100"/>
@@ -3684,7 +3612,6 @@
               <w:bottom w:val="single" w:color="B8C2CC" w:sz="4"/>
               <w:right w:val="single" w:color="B8C2CC" w:sz="4"/>
             </w:tcBorders>
-            <w:shd w:fill="F3F6F9" w:color="auto" w:val="clear"/>
             <w:tcMar>
               <w:top w:type="dxa" w:w="60"/>
               <w:left w:type="dxa" w:w="100"/>
@@ -3718,7 +3645,6 @@
               <w:bottom w:val="single" w:color="B8C2CC" w:sz="4"/>
               <w:right w:val="single" w:color="B8C2CC" w:sz="4"/>
             </w:tcBorders>
-            <w:shd w:fill="F3F6F9" w:color="auto" w:val="clear"/>
             <w:tcMar>
               <w:top w:type="dxa" w:w="60"/>
               <w:left w:type="dxa" w:w="100"/>
@@ -3752,7 +3678,6 @@
               <w:bottom w:val="single" w:color="B8C2CC" w:sz="4"/>
               <w:right w:val="single" w:color="B8C2CC" w:sz="4"/>
             </w:tcBorders>
-            <w:shd w:fill="F3F6F9" w:color="auto" w:val="clear"/>
             <w:tcMar>
               <w:top w:type="dxa" w:w="60"/>
               <w:left w:type="dxa" w:w="100"/>
@@ -3848,7 +3773,7 @@
               <w:bottom w:val="single" w:color="B8C2CC" w:sz="4"/>
               <w:right w:val="single" w:color="B8C2CC" w:sz="4"/>
             </w:tcBorders>
-            <w:shd w:fill="1F3A5F" w:color="auto" w:val="clear"/>
+            <w:shd w:fill="5B3F8C" w:color="auto" w:val="clear"/>
             <w:tcMar>
               <w:top w:type="dxa" w:w="60"/>
               <w:left w:type="dxa" w:w="100"/>
@@ -3880,7 +3805,7 @@
               <w:bottom w:val="single" w:color="B8C2CC" w:sz="4"/>
               <w:right w:val="single" w:color="B8C2CC" w:sz="4"/>
             </w:tcBorders>
-            <w:shd w:fill="1F3A5F" w:color="auto" w:val="clear"/>
+            <w:shd w:fill="5B3F8C" w:color="auto" w:val="clear"/>
             <w:tcMar>
               <w:top w:type="dxa" w:w="60"/>
               <w:left w:type="dxa" w:w="100"/>
@@ -3915,7 +3840,7 @@
               <w:bottom w:val="single" w:color="B8C2CC" w:sz="4"/>
               <w:right w:val="single" w:color="B8C2CC" w:sz="4"/>
             </w:tcBorders>
-            <w:shd w:fill="1F3A5F" w:color="auto" w:val="clear"/>
+            <w:shd w:fill="5B3F8C" w:color="auto" w:val="clear"/>
             <w:tcMar>
               <w:top w:type="dxa" w:w="60"/>
               <w:left w:type="dxa" w:w="100"/>
@@ -3950,7 +3875,7 @@
               <w:bottom w:val="single" w:color="B8C2CC" w:sz="4"/>
               <w:right w:val="single" w:color="B8C2CC" w:sz="4"/>
             </w:tcBorders>
-            <w:shd w:fill="1F3A5F" w:color="auto" w:val="clear"/>
+            <w:shd w:fill="5B3F8C" w:color="auto" w:val="clear"/>
             <w:tcMar>
               <w:top w:type="dxa" w:w="60"/>
               <w:left w:type="dxa" w:w="100"/>
@@ -4125,7 +4050,6 @@
               <w:bottom w:val="single" w:color="B8C2CC" w:sz="4"/>
               <w:right w:val="single" w:color="B8C2CC" w:sz="4"/>
             </w:tcBorders>
-            <w:shd w:fill="F3F6F9" w:color="auto" w:val="clear"/>
             <w:tcMar>
               <w:top w:type="dxa" w:w="60"/>
               <w:left w:type="dxa" w:w="100"/>
@@ -4190,7 +4114,6 @@
               <w:bottom w:val="single" w:color="B8C2CC" w:sz="4"/>
               <w:right w:val="single" w:color="B8C2CC" w:sz="4"/>
             </w:tcBorders>
-            <w:shd w:fill="F3F6F9" w:color="auto" w:val="clear"/>
             <w:tcMar>
               <w:top w:type="dxa" w:w="60"/>
               <w:left w:type="dxa" w:w="100"/>
@@ -4224,7 +4147,6 @@
               <w:bottom w:val="single" w:color="B8C2CC" w:sz="4"/>
               <w:right w:val="single" w:color="B8C2CC" w:sz="4"/>
             </w:tcBorders>
-            <w:shd w:fill="F3F6F9" w:color="auto" w:val="clear"/>
             <w:tcMar>
               <w:top w:type="dxa" w:w="60"/>
               <w:left w:type="dxa" w:w="100"/>
@@ -4398,7 +4320,6 @@
               <w:bottom w:val="single" w:color="B8C2CC" w:sz="4"/>
               <w:right w:val="single" w:color="B8C2CC" w:sz="4"/>
             </w:tcBorders>
-            <w:shd w:fill="F3F6F9" w:color="auto" w:val="clear"/>
             <w:tcMar>
               <w:top w:type="dxa" w:w="60"/>
               <w:left w:type="dxa" w:w="100"/>
@@ -4429,24 +4350,23 @@
               <w:bottom w:val="single" w:color="B8C2CC" w:sz="4"/>
               <w:right w:val="single" w:color="B8C2CC" w:sz="4"/>
             </w:tcBorders>
-            <w:shd w:fill="FFF3CD" w:color="auto" w:val="clear"/>
-            <w:tcMar>
-              <w:top w:type="dxa" w:w="60"/>
-              <w:left w:type="dxa" w:w="100"/>
-              <w:bottom w:type="dxa" w:w="60"/>
-              <w:right w:type="dxa" w:w="100"/>
-            </w:tcMar>
-            <w:vAlign w:val="center"/>
-          </w:tcPr>
-          <w:p>
-            <w:pPr>
-              <w:jc w:val="center"/>
-            </w:pPr>
-            <w:r>
-              <w:rPr>
-                <w:rFonts w:ascii="Calibri" w:cs="Calibri" w:eastAsia="Calibri" w:hAnsi="Calibri"/>
-                <w:b/>
-                <w:bCs/>
+            <w:tcMar>
+              <w:top w:type="dxa" w:w="60"/>
+              <w:left w:type="dxa" w:w="100"/>
+              <w:bottom w:type="dxa" w:w="60"/>
+              <w:right w:type="dxa" w:w="100"/>
+            </w:tcMar>
+            <w:vAlign w:val="center"/>
+          </w:tcPr>
+          <w:p>
+            <w:pPr>
+              <w:jc w:val="center"/>
+            </w:pPr>
+            <w:r>
+              <w:rPr>
+                <w:rFonts w:ascii="Calibri" w:cs="Calibri" w:eastAsia="Calibri" w:hAnsi="Calibri"/>
+                <w:b w:val="false"/>
+                <w:bCs w:val="false"/>
                 <w:sz w:val="19"/>
                 <w:szCs w:val="19"/>
               </w:rPr>
@@ -4463,7 +4383,6 @@
               <w:bottom w:val="single" w:color="B8C2CC" w:sz="4"/>
               <w:right w:val="single" w:color="B8C2CC" w:sz="4"/>
             </w:tcBorders>
-            <w:shd w:fill="F3F6F9" w:color="auto" w:val="clear"/>
             <w:tcMar>
               <w:top w:type="dxa" w:w="60"/>
               <w:left w:type="dxa" w:w="100"/>
@@ -4497,7 +4416,6 @@
               <w:bottom w:val="single" w:color="B8C2CC" w:sz="4"/>
               <w:right w:val="single" w:color="B8C2CC" w:sz="4"/>
             </w:tcBorders>
-            <w:shd w:fill="F3F6F9" w:color="auto" w:val="clear"/>
             <w:tcMar>
               <w:top w:type="dxa" w:w="60"/>
               <w:left w:type="dxa" w:w="100"/>
@@ -4670,7 +4588,6 @@
               <w:bottom w:val="single" w:color="B8C2CC" w:sz="4"/>
               <w:right w:val="single" w:color="B8C2CC" w:sz="4"/>
             </w:tcBorders>
-            <w:shd w:fill="F3F6F9" w:color="auto" w:val="clear"/>
             <w:tcMar>
               <w:top w:type="dxa" w:w="60"/>
               <w:left w:type="dxa" w:w="100"/>
@@ -4701,7 +4618,6 @@
               <w:bottom w:val="single" w:color="B8C2CC" w:sz="4"/>
               <w:right w:val="single" w:color="B8C2CC" w:sz="4"/>
             </w:tcBorders>
-            <w:shd w:fill="F3F6F9" w:color="auto" w:val="clear"/>
             <w:tcMar>
               <w:top w:type="dxa" w:w="60"/>
               <w:left w:type="dxa" w:w="100"/>
@@ -4735,7 +4651,6 @@
               <w:bottom w:val="single" w:color="B8C2CC" w:sz="4"/>
               <w:right w:val="single" w:color="B8C2CC" w:sz="4"/>
             </w:tcBorders>
-            <w:shd w:fill="F3F6F9" w:color="auto" w:val="clear"/>
             <w:tcMar>
               <w:top w:type="dxa" w:w="60"/>
               <w:left w:type="dxa" w:w="100"/>
@@ -4769,7 +4684,6 @@
               <w:bottom w:val="single" w:color="B8C2CC" w:sz="4"/>
               <w:right w:val="single" w:color="B8C2CC" w:sz="4"/>
             </w:tcBorders>
-            <w:shd w:fill="F3F6F9" w:color="auto" w:val="clear"/>
             <w:tcMar>
               <w:top w:type="dxa" w:w="60"/>
               <w:left w:type="dxa" w:w="100"/>
@@ -4942,7 +4856,6 @@
               <w:bottom w:val="single" w:color="B8C2CC" w:sz="4"/>
               <w:right w:val="single" w:color="B8C2CC" w:sz="4"/>
             </w:tcBorders>
-            <w:shd w:fill="F3F6F9" w:color="auto" w:val="clear"/>
             <w:tcMar>
               <w:top w:type="dxa" w:w="60"/>
               <w:left w:type="dxa" w:w="100"/>
@@ -4973,7 +4886,6 @@
               <w:bottom w:val="single" w:color="B8C2CC" w:sz="4"/>
               <w:right w:val="single" w:color="B8C2CC" w:sz="4"/>
             </w:tcBorders>
-            <w:shd w:fill="F3F6F9" w:color="auto" w:val="clear"/>
             <w:tcMar>
               <w:top w:type="dxa" w:w="60"/>
               <w:left w:type="dxa" w:w="100"/>
@@ -5007,7 +4919,6 @@
               <w:bottom w:val="single" w:color="B8C2CC" w:sz="4"/>
               <w:right w:val="single" w:color="B8C2CC" w:sz="4"/>
             </w:tcBorders>
-            <w:shd w:fill="F3F6F9" w:color="auto" w:val="clear"/>
             <w:tcMar>
               <w:top w:type="dxa" w:w="60"/>
               <w:left w:type="dxa" w:w="100"/>
@@ -5041,7 +4952,6 @@
               <w:bottom w:val="single" w:color="B8C2CC" w:sz="4"/>
               <w:right w:val="single" w:color="B8C2CC" w:sz="4"/>
             </w:tcBorders>
-            <w:shd w:fill="F3F6F9" w:color="auto" w:val="clear"/>
             <w:tcMar>
               <w:top w:type="dxa" w:w="60"/>
               <w:left w:type="dxa" w:w="100"/>
@@ -5214,7 +5124,6 @@
               <w:bottom w:val="single" w:color="B8C2CC" w:sz="4"/>
               <w:right w:val="single" w:color="B8C2CC" w:sz="4"/>
             </w:tcBorders>
-            <w:shd w:fill="F3F6F9" w:color="auto" w:val="clear"/>
             <w:tcMar>
               <w:top w:type="dxa" w:w="60"/>
               <w:left w:type="dxa" w:w="100"/>
@@ -5245,7 +5154,6 @@
               <w:bottom w:val="single" w:color="B8C2CC" w:sz="4"/>
               <w:right w:val="single" w:color="B8C2CC" w:sz="4"/>
             </w:tcBorders>
-            <w:shd w:fill="F3F6F9" w:color="auto" w:val="clear"/>
             <w:tcMar>
               <w:top w:type="dxa" w:w="60"/>
               <w:left w:type="dxa" w:w="100"/>
@@ -5279,7 +5187,6 @@
               <w:bottom w:val="single" w:color="B8C2CC" w:sz="4"/>
               <w:right w:val="single" w:color="B8C2CC" w:sz="4"/>
             </w:tcBorders>
-            <w:shd w:fill="F3F6F9" w:color="auto" w:val="clear"/>
             <w:tcMar>
               <w:top w:type="dxa" w:w="60"/>
               <w:left w:type="dxa" w:w="100"/>
@@ -5313,7 +5220,6 @@
               <w:bottom w:val="single" w:color="B8C2CC" w:sz="4"/>
               <w:right w:val="single" w:color="B8C2CC" w:sz="4"/>
             </w:tcBorders>
-            <w:shd w:fill="F3F6F9" w:color="auto" w:val="clear"/>
             <w:tcMar>
               <w:top w:type="dxa" w:w="60"/>
               <w:left w:type="dxa" w:w="100"/>
@@ -5621,7 +5527,7 @@
               <w:bottom w:val="single" w:color="B8C2CC" w:sz="4"/>
               <w:right w:val="single" w:color="B8C2CC" w:sz="4"/>
             </w:tcBorders>
-            <w:shd w:fill="1F3A5F" w:color="auto" w:val="clear"/>
+            <w:shd w:fill="5B3F8C" w:color="auto" w:val="clear"/>
             <w:tcMar>
               <w:top w:type="dxa" w:w="60"/>
               <w:left w:type="dxa" w:w="100"/>
@@ -5653,7 +5559,7 @@
               <w:bottom w:val="single" w:color="B8C2CC" w:sz="4"/>
               <w:right w:val="single" w:color="B8C2CC" w:sz="4"/>
             </w:tcBorders>
-            <w:shd w:fill="1F3A5F" w:color="auto" w:val="clear"/>
+            <w:shd w:fill="5B3F8C" w:color="auto" w:val="clear"/>
             <w:tcMar>
               <w:top w:type="dxa" w:w="60"/>
               <w:left w:type="dxa" w:w="100"/>
@@ -5688,7 +5594,7 @@
               <w:bottom w:val="single" w:color="B8C2CC" w:sz="4"/>
               <w:right w:val="single" w:color="B8C2CC" w:sz="4"/>
             </w:tcBorders>
-            <w:shd w:fill="1F3A5F" w:color="auto" w:val="clear"/>
+            <w:shd w:fill="5B3F8C" w:color="auto" w:val="clear"/>
             <w:tcMar>
               <w:top w:type="dxa" w:w="60"/>
               <w:left w:type="dxa" w:w="100"/>
@@ -5723,7 +5629,7 @@
               <w:bottom w:val="single" w:color="B8C2CC" w:sz="4"/>
               <w:right w:val="single" w:color="B8C2CC" w:sz="4"/>
             </w:tcBorders>
-            <w:shd w:fill="1F3A5F" w:color="auto" w:val="clear"/>
+            <w:shd w:fill="5B3F8C" w:color="auto" w:val="clear"/>
             <w:tcMar>
               <w:top w:type="dxa" w:w="60"/>
               <w:left w:type="dxa" w:w="100"/>
@@ -5758,7 +5664,7 @@
               <w:bottom w:val="single" w:color="B8C2CC" w:sz="4"/>
               <w:right w:val="single" w:color="B8C2CC" w:sz="4"/>
             </w:tcBorders>
-            <w:shd w:fill="1F3A5F" w:color="auto" w:val="clear"/>
+            <w:shd w:fill="5B3F8C" w:color="auto" w:val="clear"/>
             <w:tcMar>
               <w:top w:type="dxa" w:w="60"/>
               <w:left w:type="dxa" w:w="100"/>
@@ -5966,7 +5872,6 @@
               <w:bottom w:val="single" w:color="B8C2CC" w:sz="4"/>
               <w:right w:val="single" w:color="B8C2CC" w:sz="4"/>
             </w:tcBorders>
-            <w:shd w:fill="F3F6F9" w:color="auto" w:val="clear"/>
             <w:tcMar>
               <w:top w:type="dxa" w:w="60"/>
               <w:left w:type="dxa" w:w="100"/>
@@ -5997,7 +5902,6 @@
               <w:bottom w:val="single" w:color="B8C2CC" w:sz="4"/>
               <w:right w:val="single" w:color="B8C2CC" w:sz="4"/>
             </w:tcBorders>
-            <w:shd w:fill="F3F6F9" w:color="auto" w:val="clear"/>
             <w:tcMar>
               <w:top w:type="dxa" w:w="60"/>
               <w:left w:type="dxa" w:w="100"/>
@@ -6031,7 +5935,6 @@
               <w:bottom w:val="single" w:color="B8C2CC" w:sz="4"/>
               <w:right w:val="single" w:color="B8C2CC" w:sz="4"/>
             </w:tcBorders>
-            <w:shd w:fill="F3F6F9" w:color="auto" w:val="clear"/>
             <w:tcMar>
               <w:top w:type="dxa" w:w="60"/>
               <w:left w:type="dxa" w:w="100"/>
@@ -6065,7 +5968,6 @@
               <w:bottom w:val="single" w:color="B8C2CC" w:sz="4"/>
               <w:right w:val="single" w:color="B8C2CC" w:sz="4"/>
             </w:tcBorders>
-            <w:shd w:fill="F3F6F9" w:color="auto" w:val="clear"/>
             <w:tcMar>
               <w:top w:type="dxa" w:w="60"/>
               <w:left w:type="dxa" w:w="100"/>
@@ -6306,7 +6208,6 @@
               <w:bottom w:val="single" w:color="B8C2CC" w:sz="4"/>
               <w:right w:val="single" w:color="B8C2CC" w:sz="4"/>
             </w:tcBorders>
-            <w:shd w:fill="F3F6F9" w:color="auto" w:val="clear"/>
             <w:tcMar>
               <w:top w:type="dxa" w:w="60"/>
               <w:left w:type="dxa" w:w="100"/>
@@ -6337,7 +6238,6 @@
               <w:bottom w:val="single" w:color="B8C2CC" w:sz="4"/>
               <w:right w:val="single" w:color="B8C2CC" w:sz="4"/>
             </w:tcBorders>
-            <w:shd w:fill="F3F6F9" w:color="auto" w:val="clear"/>
             <w:tcMar>
               <w:top w:type="dxa" w:w="60"/>
               <w:left w:type="dxa" w:w="100"/>
@@ -6371,7 +6271,6 @@
               <w:bottom w:val="single" w:color="B8C2CC" w:sz="4"/>
               <w:right w:val="single" w:color="B8C2CC" w:sz="4"/>
             </w:tcBorders>
-            <w:shd w:fill="F3F6F9" w:color="auto" w:val="clear"/>
             <w:tcMar>
               <w:top w:type="dxa" w:w="60"/>
               <w:left w:type="dxa" w:w="100"/>
@@ -6405,7 +6304,6 @@
               <w:bottom w:val="single" w:color="B8C2CC" w:sz="4"/>
               <w:right w:val="single" w:color="B8C2CC" w:sz="4"/>
             </w:tcBorders>
-            <w:shd w:fill="F3F6F9" w:color="auto" w:val="clear"/>
             <w:tcMar>
               <w:top w:type="dxa" w:w="60"/>
               <w:left w:type="dxa" w:w="100"/>
@@ -6646,7 +6544,6 @@
               <w:bottom w:val="single" w:color="B8C2CC" w:sz="4"/>
               <w:right w:val="single" w:color="B8C2CC" w:sz="4"/>
             </w:tcBorders>
-            <w:shd w:fill="F3F6F9" w:color="auto" w:val="clear"/>
             <w:tcMar>
               <w:top w:type="dxa" w:w="60"/>
               <w:left w:type="dxa" w:w="100"/>
@@ -6677,7 +6574,6 @@
               <w:bottom w:val="single" w:color="B8C2CC" w:sz="4"/>
               <w:right w:val="single" w:color="B8C2CC" w:sz="4"/>
             </w:tcBorders>
-            <w:shd w:fill="F3F6F9" w:color="auto" w:val="clear"/>
             <w:tcMar>
               <w:top w:type="dxa" w:w="60"/>
               <w:left w:type="dxa" w:w="100"/>
@@ -6711,7 +6607,6 @@
               <w:bottom w:val="single" w:color="B8C2CC" w:sz="4"/>
               <w:right w:val="single" w:color="B8C2CC" w:sz="4"/>
             </w:tcBorders>
-            <w:shd w:fill="F3F6F9" w:color="auto" w:val="clear"/>
             <w:tcMar>
               <w:top w:type="dxa" w:w="60"/>
               <w:left w:type="dxa" w:w="100"/>
@@ -6745,7 +6640,6 @@
               <w:bottom w:val="single" w:color="B8C2CC" w:sz="4"/>
               <w:right w:val="single" w:color="B8C2CC" w:sz="4"/>
             </w:tcBorders>
-            <w:shd w:fill="F3F6F9" w:color="auto" w:val="clear"/>
             <w:tcMar>
               <w:top w:type="dxa" w:w="60"/>
               <w:left w:type="dxa" w:w="100"/>
@@ -6986,7 +6880,6 @@
               <w:bottom w:val="single" w:color="B8C2CC" w:sz="4"/>
               <w:right w:val="single" w:color="B8C2CC" w:sz="4"/>
             </w:tcBorders>
-            <w:shd w:fill="F3F6F9" w:color="auto" w:val="clear"/>
             <w:tcMar>
               <w:top w:type="dxa" w:w="60"/>
               <w:left w:type="dxa" w:w="100"/>
@@ -7017,7 +6910,6 @@
               <w:bottom w:val="single" w:color="B8C2CC" w:sz="4"/>
               <w:right w:val="single" w:color="B8C2CC" w:sz="4"/>
             </w:tcBorders>
-            <w:shd w:fill="F3F6F9" w:color="auto" w:val="clear"/>
             <w:tcMar>
               <w:top w:type="dxa" w:w="60"/>
               <w:left w:type="dxa" w:w="100"/>
@@ -7051,7 +6943,6 @@
               <w:bottom w:val="single" w:color="B8C2CC" w:sz="4"/>
               <w:right w:val="single" w:color="B8C2CC" w:sz="4"/>
             </w:tcBorders>
-            <w:shd w:fill="F3F6F9" w:color="auto" w:val="clear"/>
             <w:tcMar>
               <w:top w:type="dxa" w:w="60"/>
               <w:left w:type="dxa" w:w="100"/>
@@ -7085,7 +6976,6 @@
               <w:bottom w:val="single" w:color="B8C2CC" w:sz="4"/>
               <w:right w:val="single" w:color="B8C2CC" w:sz="4"/>
             </w:tcBorders>
-            <w:shd w:fill="F3F6F9" w:color="auto" w:val="clear"/>
             <w:tcMar>
               <w:top w:type="dxa" w:w="60"/>
               <w:left w:type="dxa" w:w="100"/>
@@ -7119,24 +7009,23 @@
               <w:bottom w:val="single" w:color="B8C2CC" w:sz="4"/>
               <w:right w:val="single" w:color="B8C2CC" w:sz="4"/>
             </w:tcBorders>
-            <w:shd w:fill="FFF3CD" w:color="auto" w:val="clear"/>
-            <w:tcMar>
-              <w:top w:type="dxa" w:w="60"/>
-              <w:left w:type="dxa" w:w="100"/>
-              <w:bottom w:type="dxa" w:w="60"/>
-              <w:right w:type="dxa" w:w="100"/>
-            </w:tcMar>
-            <w:vAlign w:val="center"/>
-          </w:tcPr>
-          <w:p>
-            <w:pPr>
-              <w:jc w:val="center"/>
-            </w:pPr>
-            <w:r>
-              <w:rPr>
-                <w:rFonts w:ascii="Calibri" w:cs="Calibri" w:eastAsia="Calibri" w:hAnsi="Calibri"/>
-                <w:b/>
-                <w:bCs/>
+            <w:tcMar>
+              <w:top w:type="dxa" w:w="60"/>
+              <w:left w:type="dxa" w:w="100"/>
+              <w:bottom w:type="dxa" w:w="60"/>
+              <w:right w:type="dxa" w:w="100"/>
+            </w:tcMar>
+            <w:vAlign w:val="center"/>
+          </w:tcPr>
+          <w:p>
+            <w:pPr>
+              <w:jc w:val="center"/>
+            </w:pPr>
+            <w:r>
+              <w:rPr>
+                <w:rFonts w:ascii="Calibri" w:cs="Calibri" w:eastAsia="Calibri" w:hAnsi="Calibri"/>
+                <w:b w:val="false"/>
+                <w:bCs w:val="false"/>
                 <w:sz w:val="19"/>
                 <w:szCs w:val="19"/>
               </w:rPr>
@@ -7501,7 +7390,7 @@
               <w:bottom w:val="single" w:color="B8C2CC" w:sz="4"/>
               <w:right w:val="single" w:color="B8C2CC" w:sz="4"/>
             </w:tcBorders>
-            <w:shd w:fill="1F3A5F" w:color="auto" w:val="clear"/>
+            <w:shd w:fill="5B3F8C" w:color="auto" w:val="clear"/>
             <w:tcMar>
               <w:top w:type="dxa" w:w="60"/>
               <w:left w:type="dxa" w:w="100"/>
@@ -7533,7 +7422,7 @@
               <w:bottom w:val="single" w:color="B8C2CC" w:sz="4"/>
               <w:right w:val="single" w:color="B8C2CC" w:sz="4"/>
             </w:tcBorders>
-            <w:shd w:fill="1F3A5F" w:color="auto" w:val="clear"/>
+            <w:shd w:fill="5B3F8C" w:color="auto" w:val="clear"/>
             <w:tcMar>
               <w:top w:type="dxa" w:w="60"/>
               <w:left w:type="dxa" w:w="100"/>
@@ -7565,7 +7454,7 @@
               <w:bottom w:val="single" w:color="B8C2CC" w:sz="4"/>
               <w:right w:val="single" w:color="B8C2CC" w:sz="4"/>
             </w:tcBorders>
-            <w:shd w:fill="1F3A5F" w:color="auto" w:val="clear"/>
+            <w:shd w:fill="5B3F8C" w:color="auto" w:val="clear"/>
             <w:tcMar>
               <w:top w:type="dxa" w:w="60"/>
               <w:left w:type="dxa" w:w="100"/>
@@ -7597,7 +7486,7 @@
               <w:bottom w:val="single" w:color="B8C2CC" w:sz="4"/>
               <w:right w:val="single" w:color="B8C2CC" w:sz="4"/>
             </w:tcBorders>
-            <w:shd w:fill="1F3A5F" w:color="auto" w:val="clear"/>
+            <w:shd w:fill="5B3F8C" w:color="auto" w:val="clear"/>
             <w:tcMar>
               <w:top w:type="dxa" w:w="60"/>
               <w:left w:type="dxa" w:w="100"/>
@@ -7760,7 +7649,6 @@
               <w:bottom w:val="single" w:color="B8C2CC" w:sz="4"/>
               <w:right w:val="single" w:color="B8C2CC" w:sz="4"/>
             </w:tcBorders>
-            <w:shd w:fill="F3F6F9" w:color="auto" w:val="clear"/>
             <w:tcMar>
               <w:top w:type="dxa" w:w="60"/>
               <w:left w:type="dxa" w:w="100"/>
@@ -7791,7 +7679,6 @@
               <w:bottom w:val="single" w:color="B8C2CC" w:sz="4"/>
               <w:right w:val="single" w:color="B8C2CC" w:sz="4"/>
             </w:tcBorders>
-            <w:shd w:fill="F3F6F9" w:color="auto" w:val="clear"/>
             <w:tcMar>
               <w:top w:type="dxa" w:w="60"/>
               <w:left w:type="dxa" w:w="100"/>
@@ -7853,7 +7740,6 @@
               <w:bottom w:val="single" w:color="B8C2CC" w:sz="4"/>
               <w:right w:val="single" w:color="B8C2CC" w:sz="4"/>
             </w:tcBorders>
-            <w:shd w:fill="F3F6F9" w:color="auto" w:val="clear"/>
             <w:tcMar>
               <w:top w:type="dxa" w:w="60"/>
               <w:left w:type="dxa" w:w="100"/>
@@ -8015,7 +7901,6 @@
               <w:bottom w:val="single" w:color="B8C2CC" w:sz="4"/>
               <w:right w:val="single" w:color="B8C2CC" w:sz="4"/>
             </w:tcBorders>
-            <w:shd w:fill="F3F6F9" w:color="auto" w:val="clear"/>
             <w:tcMar>
               <w:top w:type="dxa" w:w="60"/>
               <w:left w:type="dxa" w:w="100"/>
@@ -8046,7 +7931,6 @@
               <w:bottom w:val="single" w:color="B8C2CC" w:sz="4"/>
               <w:right w:val="single" w:color="B8C2CC" w:sz="4"/>
             </w:tcBorders>
-            <w:shd w:fill="F3F6F9" w:color="auto" w:val="clear"/>
             <w:tcMar>
               <w:top w:type="dxa" w:w="60"/>
               <w:left w:type="dxa" w:w="100"/>
@@ -8077,21 +7961,20 @@
               <w:bottom w:val="single" w:color="B8C2CC" w:sz="4"/>
               <w:right w:val="single" w:color="B8C2CC" w:sz="4"/>
             </w:tcBorders>
-            <w:shd w:fill="FFF3CD" w:color="auto" w:val="clear"/>
-            <w:tcMar>
-              <w:top w:type="dxa" w:w="60"/>
-              <w:left w:type="dxa" w:w="100"/>
-              <w:bottom w:type="dxa" w:w="60"/>
-              <w:right w:type="dxa" w:w="100"/>
-            </w:tcMar>
-            <w:vAlign w:val="center"/>
-          </w:tcPr>
-          <w:p>
-            <w:r>
-              <w:rPr>
-                <w:rFonts w:ascii="Calibri" w:cs="Calibri" w:eastAsia="Calibri" w:hAnsi="Calibri"/>
-                <w:b/>
-                <w:bCs/>
+            <w:tcMar>
+              <w:top w:type="dxa" w:w="60"/>
+              <w:left w:type="dxa" w:w="100"/>
+              <w:bottom w:type="dxa" w:w="60"/>
+              <w:right w:type="dxa" w:w="100"/>
+            </w:tcMar>
+            <w:vAlign w:val="center"/>
+          </w:tcPr>
+          <w:p>
+            <w:r>
+              <w:rPr>
+                <w:rFonts w:ascii="Calibri" w:cs="Calibri" w:eastAsia="Calibri" w:hAnsi="Calibri"/>
+                <w:b w:val="false"/>
+                <w:bCs w:val="false"/>
                 <w:sz w:val="19"/>
                 <w:szCs w:val="19"/>
               </w:rPr>
@@ -8108,7 +7991,6 @@
               <w:bottom w:val="single" w:color="B8C2CC" w:sz="4"/>
               <w:right w:val="single" w:color="B8C2CC" w:sz="4"/>
             </w:tcBorders>
-            <w:shd w:fill="F3F6F9" w:color="auto" w:val="clear"/>
             <w:tcMar>
               <w:top w:type="dxa" w:w="60"/>
               <w:left w:type="dxa" w:w="100"/>
@@ -8204,21 +8086,20 @@
               <w:bottom w:val="single" w:color="B8C2CC" w:sz="4"/>
               <w:right w:val="single" w:color="B8C2CC" w:sz="4"/>
             </w:tcBorders>
-            <w:shd w:fill="FFF3CD" w:color="auto" w:val="clear"/>
-            <w:tcMar>
-              <w:top w:type="dxa" w:w="60"/>
-              <w:left w:type="dxa" w:w="100"/>
-              <w:bottom w:type="dxa" w:w="60"/>
-              <w:right w:type="dxa" w:w="100"/>
-            </w:tcMar>
-            <w:vAlign w:val="center"/>
-          </w:tcPr>
-          <w:p>
-            <w:r>
-              <w:rPr>
-                <w:rFonts w:ascii="Calibri" w:cs="Calibri" w:eastAsia="Calibri" w:hAnsi="Calibri"/>
-                <w:b/>
-                <w:bCs/>
+            <w:tcMar>
+              <w:top w:type="dxa" w:w="60"/>
+              <w:left w:type="dxa" w:w="100"/>
+              <w:bottom w:type="dxa" w:w="60"/>
+              <w:right w:type="dxa" w:w="100"/>
+            </w:tcMar>
+            <w:vAlign w:val="center"/>
+          </w:tcPr>
+          <w:p>
+            <w:r>
+              <w:rPr>
+                <w:rFonts w:ascii="Calibri" w:cs="Calibri" w:eastAsia="Calibri" w:hAnsi="Calibri"/>
+                <w:b w:val="false"/>
+                <w:bCs w:val="false"/>
                 <w:sz w:val="19"/>
                 <w:szCs w:val="19"/>
               </w:rPr>
@@ -8270,7 +8151,6 @@
               <w:bottom w:val="single" w:color="B8C2CC" w:sz="4"/>
               <w:right w:val="single" w:color="B8C2CC" w:sz="4"/>
             </w:tcBorders>
-            <w:shd w:fill="F3F6F9" w:color="auto" w:val="clear"/>
             <w:tcMar>
               <w:top w:type="dxa" w:w="60"/>
               <w:left w:type="dxa" w:w="100"/>
@@ -8301,7 +8181,6 @@
               <w:bottom w:val="single" w:color="B8C2CC" w:sz="4"/>
               <w:right w:val="single" w:color="B8C2CC" w:sz="4"/>
             </w:tcBorders>
-            <w:shd w:fill="F3F6F9" w:color="auto" w:val="clear"/>
             <w:tcMar>
               <w:top w:type="dxa" w:w="60"/>
               <w:left w:type="dxa" w:w="100"/>
@@ -8332,21 +8211,20 @@
               <w:bottom w:val="single" w:color="B8C2CC" w:sz="4"/>
               <w:right w:val="single" w:color="B8C2CC" w:sz="4"/>
             </w:tcBorders>
-            <w:shd w:fill="FFF3CD" w:color="auto" w:val="clear"/>
-            <w:tcMar>
-              <w:top w:type="dxa" w:w="60"/>
-              <w:left w:type="dxa" w:w="100"/>
-              <w:bottom w:type="dxa" w:w="60"/>
-              <w:right w:type="dxa" w:w="100"/>
-            </w:tcMar>
-            <w:vAlign w:val="center"/>
-          </w:tcPr>
-          <w:p>
-            <w:r>
-              <w:rPr>
-                <w:rFonts w:ascii="Calibri" w:cs="Calibri" w:eastAsia="Calibri" w:hAnsi="Calibri"/>
-                <w:b/>
-                <w:bCs/>
+            <w:tcMar>
+              <w:top w:type="dxa" w:w="60"/>
+              <w:left w:type="dxa" w:w="100"/>
+              <w:bottom w:type="dxa" w:w="60"/>
+              <w:right w:type="dxa" w:w="100"/>
+            </w:tcMar>
+            <w:vAlign w:val="center"/>
+          </w:tcPr>
+          <w:p>
+            <w:r>
+              <w:rPr>
+                <w:rFonts w:ascii="Calibri" w:cs="Calibri" w:eastAsia="Calibri" w:hAnsi="Calibri"/>
+                <w:b w:val="false"/>
+                <w:bCs w:val="false"/>
                 <w:sz w:val="19"/>
                 <w:szCs w:val="19"/>
               </w:rPr>
@@ -8363,7 +8241,6 @@
               <w:bottom w:val="single" w:color="B8C2CC" w:sz="4"/>
               <w:right w:val="single" w:color="B8C2CC" w:sz="4"/>
             </w:tcBorders>
-            <w:shd w:fill="F3F6F9" w:color="auto" w:val="clear"/>
             <w:tcMar>
               <w:top w:type="dxa" w:w="60"/>
               <w:left w:type="dxa" w:w="100"/>
@@ -8459,21 +8336,20 @@
               <w:bottom w:val="single" w:color="B8C2CC" w:sz="4"/>
               <w:right w:val="single" w:color="B8C2CC" w:sz="4"/>
             </w:tcBorders>
-            <w:shd w:fill="FFF3CD" w:color="auto" w:val="clear"/>
-            <w:tcMar>
-              <w:top w:type="dxa" w:w="60"/>
-              <w:left w:type="dxa" w:w="100"/>
-              <w:bottom w:type="dxa" w:w="60"/>
-              <w:right w:type="dxa" w:w="100"/>
-            </w:tcMar>
-            <w:vAlign w:val="center"/>
-          </w:tcPr>
-          <w:p>
-            <w:r>
-              <w:rPr>
-                <w:rFonts w:ascii="Calibri" w:cs="Calibri" w:eastAsia="Calibri" w:hAnsi="Calibri"/>
-                <w:b/>
-                <w:bCs/>
+            <w:tcMar>
+              <w:top w:type="dxa" w:w="60"/>
+              <w:left w:type="dxa" w:w="100"/>
+              <w:bottom w:type="dxa" w:w="60"/>
+              <w:right w:type="dxa" w:w="100"/>
+            </w:tcMar>
+            <w:vAlign w:val="center"/>
+          </w:tcPr>
+          <w:p>
+            <w:r>
+              <w:rPr>
+                <w:rFonts w:ascii="Calibri" w:cs="Calibri" w:eastAsia="Calibri" w:hAnsi="Calibri"/>
+                <w:b w:val="false"/>
+                <w:bCs w:val="false"/>
                 <w:sz w:val="19"/>
                 <w:szCs w:val="19"/>
               </w:rPr>
@@ -8525,7 +8401,6 @@
               <w:bottom w:val="single" w:color="B8C2CC" w:sz="4"/>
               <w:right w:val="single" w:color="B8C2CC" w:sz="4"/>
             </w:tcBorders>
-            <w:shd w:fill="F3F6F9" w:color="auto" w:val="clear"/>
             <w:tcMar>
               <w:top w:type="dxa" w:w="60"/>
               <w:left w:type="dxa" w:w="100"/>
@@ -8556,7 +8431,6 @@
               <w:bottom w:val="single" w:color="B8C2CC" w:sz="4"/>
               <w:right w:val="single" w:color="B8C2CC" w:sz="4"/>
             </w:tcBorders>
-            <w:shd w:fill="F3F6F9" w:color="auto" w:val="clear"/>
             <w:tcMar>
               <w:top w:type="dxa" w:w="60"/>
               <w:left w:type="dxa" w:w="100"/>
@@ -8587,21 +8461,20 @@
               <w:bottom w:val="single" w:color="B8C2CC" w:sz="4"/>
               <w:right w:val="single" w:color="B8C2CC" w:sz="4"/>
             </w:tcBorders>
-            <w:shd w:fill="D5EDDA" w:color="auto" w:val="clear"/>
-            <w:tcMar>
-              <w:top w:type="dxa" w:w="60"/>
-              <w:left w:type="dxa" w:w="100"/>
-              <w:bottom w:type="dxa" w:w="60"/>
-              <w:right w:type="dxa" w:w="100"/>
-            </w:tcMar>
-            <w:vAlign w:val="center"/>
-          </w:tcPr>
-          <w:p>
-            <w:r>
-              <w:rPr>
-                <w:rFonts w:ascii="Calibri" w:cs="Calibri" w:eastAsia="Calibri" w:hAnsi="Calibri"/>
-                <w:b/>
-                <w:bCs/>
+            <w:tcMar>
+              <w:top w:type="dxa" w:w="60"/>
+              <w:left w:type="dxa" w:w="100"/>
+              <w:bottom w:type="dxa" w:w="60"/>
+              <w:right w:type="dxa" w:w="100"/>
+            </w:tcMar>
+            <w:vAlign w:val="center"/>
+          </w:tcPr>
+          <w:p>
+            <w:r>
+              <w:rPr>
+                <w:rFonts w:ascii="Calibri" w:cs="Calibri" w:eastAsia="Calibri" w:hAnsi="Calibri"/>
+                <w:b w:val="false"/>
+                <w:bCs w:val="false"/>
                 <w:sz w:val="19"/>
                 <w:szCs w:val="19"/>
               </w:rPr>
@@ -8618,7 +8491,6 @@
               <w:bottom w:val="single" w:color="B8C2CC" w:sz="4"/>
               <w:right w:val="single" w:color="B8C2CC" w:sz="4"/>
             </w:tcBorders>
-            <w:shd w:fill="F3F6F9" w:color="auto" w:val="clear"/>
             <w:tcMar>
               <w:top w:type="dxa" w:w="60"/>
               <w:left w:type="dxa" w:w="100"/>
@@ -8658,62 +8530,25 @@
         <w:t xml:space="preserve">9. Dictamen y criterios de salida</w:t>
       </w:r>
     </w:p>
-    <w:tbl>
-      <w:tblPr>
-        <w:tblW w:type="dxa" w:w="9360"/>
-        <w:tblBorders>
-          <w:top w:val="single" w:color="auto" w:sz="4"/>
-          <w:left w:val="single" w:color="auto" w:sz="4"/>
-          <w:bottom w:val="single" w:color="auto" w:sz="4"/>
-          <w:right w:val="single" w:color="auto" w:sz="4"/>
-          <w:insideH w:val="single" w:color="auto" w:sz="4"/>
-          <w:insideV w:val="single" w:color="auto" w:sz="4"/>
-        </w:tblBorders>
-      </w:tblPr>
-      <w:tblGrid>
-        <w:gridCol w:w="9360"/>
-      </w:tblGrid>
-      <w:tr>
-        <w:tc>
-          <w:tcPr>
-            <w:tcW w:type="dxa" w:w="9360"/>
-            <w:tcBorders>
-              <w:top w:val="none" w:color="FFFFFF" w:sz="0"/>
-              <w:left w:val="single" w:color="1F3A5F" w:sz="24"/>
-              <w:bottom w:val="none" w:color="FFFFFF" w:sz="0"/>
-              <w:right w:val="none" w:color="FFFFFF" w:sz="0"/>
-            </w:tcBorders>
-            <w:shd w:fill="FBEDEE" w:color="auto" w:val="clear"/>
-            <w:tcMar>
-              <w:top w:type="dxa" w:w="120"/>
-              <w:left w:type="dxa" w:w="200"/>
-              <w:bottom w:type="dxa" w:w="120"/>
-              <w:right w:type="dxa" w:w="200"/>
-            </w:tcMar>
-          </w:tcPr>
-          <w:p>
-            <w:r>
-              <w:rPr>
-                <w:rFonts w:ascii="Calibri" w:cs="Calibri" w:eastAsia="Calibri" w:hAnsi="Calibri"/>
-                <w:b/>
-                <w:bCs/>
-                <w:sz w:val="21"/>
-                <w:szCs w:val="21"/>
-              </w:rPr>
-              <w:t xml:space="preserve">Recomendación: no liberar a producción ahora; mantener el piloto y liberar de forma condicionada</w:t>
-            </w:r>
-            <w:r>
-              <w:rPr>
-                <w:rFonts w:ascii="Calibri" w:cs="Calibri" w:eastAsia="Calibri" w:hAnsi="Calibri"/>
-                <w:sz w:val="21"/>
-                <w:szCs w:val="21"/>
-              </w:rPr>
-              <w:t xml:space="preserve"> cuando se cumplan los criterios de salida.</w:t>
-            </w:r>
-          </w:p>
-        </w:tc>
-      </w:tr>
-    </w:tbl>
+    <w:p>
+      <w:pPr>
+        <w:spacing w:after="120" w:line="276"/>
+      </w:pPr>
+      <w:r>
+        <w:rPr>
+          <w:rFonts w:ascii="Calibri" w:cs="Calibri" w:eastAsia="Calibri" w:hAnsi="Calibri"/>
+          <w:b/>
+          <w:bCs/>
+        </w:rPr>
+        <w:t xml:space="preserve">Recomendación: no liberar a producción ahora; mantener el piloto y liberar de forma condicionada</w:t>
+      </w:r>
+      <w:r>
+        <w:rPr>
+          <w:rFonts w:ascii="Calibri" w:cs="Calibri" w:eastAsia="Calibri" w:hAnsi="Calibri"/>
+        </w:rPr>
+        <w:t xml:space="preserve"> cuando se cumplan los criterios de salida.</w:t>
+      </w:r>
+    </w:p>
     <w:p>
       <w:pPr>
         <w:spacing w:after="80"/>
@@ -8802,7 +8637,7 @@
               <w:bottom w:val="single" w:color="B8C2CC" w:sz="4"/>
               <w:right w:val="single" w:color="B8C2CC" w:sz="4"/>
             </w:tcBorders>
-            <w:shd w:fill="1F3A5F" w:color="auto" w:val="clear"/>
+            <w:shd w:fill="5B3F8C" w:color="auto" w:val="clear"/>
             <w:tcMar>
               <w:top w:type="dxa" w:w="60"/>
               <w:left w:type="dxa" w:w="100"/>
@@ -8834,7 +8669,7 @@
               <w:bottom w:val="single" w:color="B8C2CC" w:sz="4"/>
               <w:right w:val="single" w:color="B8C2CC" w:sz="4"/>
             </w:tcBorders>
-            <w:shd w:fill="1F3A5F" w:color="auto" w:val="clear"/>
+            <w:shd w:fill="5B3F8C" w:color="auto" w:val="clear"/>
             <w:tcMar>
               <w:top w:type="dxa" w:w="60"/>
               <w:left w:type="dxa" w:w="100"/>
@@ -8869,7 +8704,7 @@
               <w:bottom w:val="single" w:color="B8C2CC" w:sz="4"/>
               <w:right w:val="single" w:color="B8C2CC" w:sz="4"/>
             </w:tcBorders>
-            <w:shd w:fill="1F3A5F" w:color="auto" w:val="clear"/>
+            <w:shd w:fill="5B3F8C" w:color="auto" w:val="clear"/>
             <w:tcMar>
               <w:top w:type="dxa" w:w="60"/>
               <w:left w:type="dxa" w:w="100"/>
@@ -8904,7 +8739,7 @@
               <w:bottom w:val="single" w:color="B8C2CC" w:sz="4"/>
               <w:right w:val="single" w:color="B8C2CC" w:sz="4"/>
             </w:tcBorders>
-            <w:shd w:fill="1F3A5F" w:color="auto" w:val="clear"/>
+            <w:shd w:fill="5B3F8C" w:color="auto" w:val="clear"/>
             <w:tcMar>
               <w:top w:type="dxa" w:w="60"/>
               <w:left w:type="dxa" w:w="100"/>
@@ -9078,7 +8913,6 @@
               <w:bottom w:val="single" w:color="B8C2CC" w:sz="4"/>
               <w:right w:val="single" w:color="B8C2CC" w:sz="4"/>
             </w:tcBorders>
-            <w:shd w:fill="F3F6F9" w:color="auto" w:val="clear"/>
             <w:tcMar>
               <w:top w:type="dxa" w:w="60"/>
               <w:left w:type="dxa" w:w="100"/>
@@ -9109,7 +8943,6 @@
               <w:bottom w:val="single" w:color="B8C2CC" w:sz="4"/>
               <w:right w:val="single" w:color="B8C2CC" w:sz="4"/>
             </w:tcBorders>
-            <w:shd w:fill="F3F6F9" w:color="auto" w:val="clear"/>
             <w:tcMar>
               <w:top w:type="dxa" w:w="60"/>
               <w:left w:type="dxa" w:w="100"/>
@@ -9143,7 +8976,6 @@
               <w:bottom w:val="single" w:color="B8C2CC" w:sz="4"/>
               <w:right w:val="single" w:color="B8C2CC" w:sz="4"/>
             </w:tcBorders>
-            <w:shd w:fill="F3F6F9" w:color="auto" w:val="clear"/>
             <w:tcMar>
               <w:top w:type="dxa" w:w="60"/>
               <w:left w:type="dxa" w:w="100"/>
@@ -9177,7 +9009,6 @@
               <w:bottom w:val="single" w:color="B8C2CC" w:sz="4"/>
               <w:right w:val="single" w:color="B8C2CC" w:sz="4"/>
             </w:tcBorders>
-            <w:shd w:fill="F3F6F9" w:color="auto" w:val="clear"/>
             <w:tcMar>
               <w:top w:type="dxa" w:w="60"/>
               <w:left w:type="dxa" w:w="100"/>
@@ -9350,7 +9181,6 @@
               <w:bottom w:val="single" w:color="B8C2CC" w:sz="4"/>
               <w:right w:val="single" w:color="B8C2CC" w:sz="4"/>
             </w:tcBorders>
-            <w:shd w:fill="F3F6F9" w:color="auto" w:val="clear"/>
             <w:tcMar>
               <w:top w:type="dxa" w:w="60"/>
               <w:left w:type="dxa" w:w="100"/>
@@ -9381,7 +9211,6 @@
               <w:bottom w:val="single" w:color="B8C2CC" w:sz="4"/>
               <w:right w:val="single" w:color="B8C2CC" w:sz="4"/>
             </w:tcBorders>
-            <w:shd w:fill="F3F6F9" w:color="auto" w:val="clear"/>
             <w:tcMar>
               <w:top w:type="dxa" w:w="60"/>
               <w:left w:type="dxa" w:w="100"/>
@@ -9415,7 +9244,6 @@
               <w:bottom w:val="single" w:color="B8C2CC" w:sz="4"/>
               <w:right w:val="single" w:color="B8C2CC" w:sz="4"/>
             </w:tcBorders>
-            <w:shd w:fill="F3F6F9" w:color="auto" w:val="clear"/>
             <w:tcMar>
               <w:top w:type="dxa" w:w="60"/>
               <w:left w:type="dxa" w:w="100"/>
@@ -9449,7 +9277,6 @@
               <w:bottom w:val="single" w:color="B8C2CC" w:sz="4"/>
               <w:right w:val="single" w:color="B8C2CC" w:sz="4"/>
             </w:tcBorders>
-            <w:shd w:fill="F3F6F9" w:color="auto" w:val="clear"/>
             <w:tcMar>
               <w:top w:type="dxa" w:w="60"/>
               <w:left w:type="dxa" w:w="100"/>
@@ -9622,7 +9449,6 @@
               <w:bottom w:val="single" w:color="B8C2CC" w:sz="4"/>
               <w:right w:val="single" w:color="B8C2CC" w:sz="4"/>
             </w:tcBorders>
-            <w:shd w:fill="F3F6F9" w:color="auto" w:val="clear"/>
             <w:tcMar>
               <w:top w:type="dxa" w:w="60"/>
               <w:left w:type="dxa" w:w="100"/>
@@ -9653,7 +9479,6 @@
               <w:bottom w:val="single" w:color="B8C2CC" w:sz="4"/>
               <w:right w:val="single" w:color="B8C2CC" w:sz="4"/>
             </w:tcBorders>
-            <w:shd w:fill="F3F6F9" w:color="auto" w:val="clear"/>
             <w:tcMar>
               <w:top w:type="dxa" w:w="60"/>
               <w:left w:type="dxa" w:w="100"/>
@@ -9687,7 +9512,6 @@
               <w:bottom w:val="single" w:color="B8C2CC" w:sz="4"/>
               <w:right w:val="single" w:color="B8C2CC" w:sz="4"/>
             </w:tcBorders>
-            <w:shd w:fill="F3F6F9" w:color="auto" w:val="clear"/>
             <w:tcMar>
               <w:top w:type="dxa" w:w="60"/>
               <w:left w:type="dxa" w:w="100"/>
@@ -9721,7 +9545,6 @@
               <w:bottom w:val="single" w:color="B8C2CC" w:sz="4"/>
               <w:right w:val="single" w:color="B8C2CC" w:sz="4"/>
             </w:tcBorders>
-            <w:shd w:fill="F3F6F9" w:color="auto" w:val="clear"/>
             <w:tcMar>
               <w:top w:type="dxa" w:w="60"/>
               <w:left w:type="dxa" w:w="100"/>
@@ -10118,7 +9941,7 @@
               <w:bottom w:val="single" w:color="B8C2CC" w:sz="4"/>
               <w:right w:val="single" w:color="B8C2CC" w:sz="4"/>
             </w:tcBorders>
-            <w:shd w:fill="1F3A5F" w:color="auto" w:val="clear"/>
+            <w:shd w:fill="5B3F8C" w:color="auto" w:val="clear"/>
             <w:tcMar>
               <w:top w:type="dxa" w:w="60"/>
               <w:left w:type="dxa" w:w="100"/>
@@ -10150,7 +9973,7 @@
               <w:bottom w:val="single" w:color="B8C2CC" w:sz="4"/>
               <w:right w:val="single" w:color="B8C2CC" w:sz="4"/>
             </w:tcBorders>
-            <w:shd w:fill="1F3A5F" w:color="auto" w:val="clear"/>
+            <w:shd w:fill="5B3F8C" w:color="auto" w:val="clear"/>
             <w:tcMar>
               <w:top w:type="dxa" w:w="60"/>
               <w:left w:type="dxa" w:w="100"/>
@@ -10252,7 +10075,6 @@
               <w:bottom w:val="single" w:color="B8C2CC" w:sz="4"/>
               <w:right w:val="single" w:color="B8C2CC" w:sz="4"/>
             </w:tcBorders>
-            <w:shd w:fill="F3F6F9" w:color="auto" w:val="clear"/>
             <w:tcMar>
               <w:top w:type="dxa" w:w="60"/>
               <w:left w:type="dxa" w:w="100"/>
@@ -10283,7 +10105,6 @@
               <w:bottom w:val="single" w:color="B8C2CC" w:sz="4"/>
               <w:right w:val="single" w:color="B8C2CC" w:sz="4"/>
             </w:tcBorders>
-            <w:shd w:fill="F3F6F9" w:color="auto" w:val="clear"/>
             <w:tcMar>
               <w:top w:type="dxa" w:w="60"/>
               <w:left w:type="dxa" w:w="100"/>
@@ -10384,7 +10205,6 @@
               <w:bottom w:val="single" w:color="B8C2CC" w:sz="4"/>
               <w:right w:val="single" w:color="B8C2CC" w:sz="4"/>
             </w:tcBorders>
-            <w:shd w:fill="F3F6F9" w:color="auto" w:val="clear"/>
             <w:tcMar>
               <w:top w:type="dxa" w:w="60"/>
               <w:left w:type="dxa" w:w="100"/>
@@ -10415,7 +10235,6 @@
               <w:bottom w:val="single" w:color="B8C2CC" w:sz="4"/>
               <w:right w:val="single" w:color="B8C2CC" w:sz="4"/>
             </w:tcBorders>
-            <w:shd w:fill="F3F6F9" w:color="auto" w:val="clear"/>
             <w:tcMar>
               <w:top w:type="dxa" w:w="60"/>
               <w:left w:type="dxa" w:w="100"/>
@@ -10516,7 +10335,6 @@
               <w:bottom w:val="single" w:color="B8C2CC" w:sz="4"/>
               <w:right w:val="single" w:color="B8C2CC" w:sz="4"/>
             </w:tcBorders>
-            <w:shd w:fill="F3F6F9" w:color="auto" w:val="clear"/>
             <w:tcMar>
               <w:top w:type="dxa" w:w="60"/>
               <w:left w:type="dxa" w:w="100"/>
@@ -10547,7 +10365,6 @@
               <w:bottom w:val="single" w:color="B8C2CC" w:sz="4"/>
               <w:right w:val="single" w:color="B8C2CC" w:sz="4"/>
             </w:tcBorders>
-            <w:shd w:fill="F3F6F9" w:color="auto" w:val="clear"/>
             <w:tcMar>
               <w:top w:type="dxa" w:w="60"/>
               <w:left w:type="dxa" w:w="100"/>
@@ -11170,7 +10987,7 @@
       <w:rFonts w:ascii="Calibri" w:cs="Calibri" w:eastAsia="Calibri" w:hAnsi="Calibri"/>
       <w:b/>
       <w:bCs/>
-      <w:color w:val="1F3A5F"/>
+      <w:color w:val="5B3F8C"/>
       <w:sz w:val="30"/>
       <w:szCs w:val="30"/>
     </w:rPr>
@@ -11189,7 +11006,7 @@
       <w:rFonts w:ascii="Calibri" w:cs="Calibri" w:eastAsia="Calibri" w:hAnsi="Calibri"/>
       <w:b/>
       <w:bCs/>
-      <w:color w:val="2E5C8A"/>
+      <w:color w:val="7A5BA8"/>
       <w:sz w:val="24"/>
       <w:szCs w:val="24"/>
     </w:rPr>

</xml_diff>